<commit_message>
docs: ficha de avance 05 actualizada y se agrega el diagrama de flujo en evidencias
</commit_message>
<xml_diff>
--- a/Fase 2/Iteracion de fichas/Ficha_Avance_05_Proyecto_Capstone.docx
+++ b/Fase 2/Iteracion de fichas/Ficha_Avance_05_Proyecto_Capstone.docx
@@ -404,21 +404,7 @@
         <w:rPr>
           <w:lang w:val="es-CL"/>
         </w:rPr>
-        <w:t xml:space="preserve">2 </w:t>
-      </w:r>
-      <w:proofErr w:type="gramStart"/>
-      <w:r>
-        <w:rPr>
-          <w:lang w:val="es-CL"/>
-        </w:rPr>
-        <w:t>Diagrama</w:t>
-      </w:r>
-      <w:proofErr w:type="gramEnd"/>
-      <w:r>
-        <w:rPr>
-          <w:lang w:val="es-CL"/>
-        </w:rPr>
-        <w:t xml:space="preserve"> que deben presentar</w:t>
+        <w:t>2 Diagrama que deben presentar</w:t>
       </w:r>
     </w:p>
     <w:p>
@@ -687,21 +673,7 @@
           <w:lang w:val="es-CL"/>
         </w:rPr>
         <w:lastRenderedPageBreak/>
-        <w:t xml:space="preserve">3 </w:t>
-      </w:r>
-      <w:proofErr w:type="gramStart"/>
-      <w:r>
-        <w:rPr>
-          <w:lang w:val="es-CL"/>
-        </w:rPr>
-        <w:t>Cruce</w:t>
-      </w:r>
-      <w:proofErr w:type="gramEnd"/>
-      <w:r>
-        <w:rPr>
-          <w:lang w:val="es-CL"/>
-        </w:rPr>
-        <w:t xml:space="preserve"> con las funcionalidades de la ficha 04</w:t>
+        <w:t>3 Cruce con las funcionalidades de la ficha 04</w:t>
       </w:r>
     </w:p>
     <w:p>
@@ -1536,19 +1508,11 @@
               <w:t xml:space="preserve">, </w:t>
             </w:r>
             <w:proofErr w:type="spellStart"/>
-            <w:proofErr w:type="gramStart"/>
-            <w:r>
-              <w:rPr>
-                <w:lang w:val="es-CL"/>
-              </w:rPr>
-              <w:t>notas.service</w:t>
-            </w:r>
-            <w:proofErr w:type="gramEnd"/>
-            <w:r>
-              <w:rPr>
-                <w:lang w:val="es-CL"/>
-              </w:rPr>
-              <w:t>.ts</w:t>
+            <w:r>
+              <w:rPr>
+                <w:lang w:val="es-CL"/>
+              </w:rPr>
+              <w:t>notas.service.ts</w:t>
             </w:r>
             <w:proofErr w:type="spellEnd"/>
             <w:r>
@@ -1758,19 +1722,11 @@
               <w:t xml:space="preserve">, </w:t>
             </w:r>
             <w:proofErr w:type="spellStart"/>
-            <w:proofErr w:type="gramStart"/>
-            <w:r>
-              <w:rPr>
-                <w:lang w:val="es-CL"/>
-              </w:rPr>
-              <w:t>notas.service</w:t>
-            </w:r>
-            <w:proofErr w:type="gramEnd"/>
-            <w:r>
-              <w:rPr>
-                <w:lang w:val="es-CL"/>
-              </w:rPr>
-              <w:t>.ts</w:t>
+            <w:r>
+              <w:rPr>
+                <w:lang w:val="es-CL"/>
+              </w:rPr>
+              <w:t>notas.service.ts</w:t>
             </w:r>
             <w:proofErr w:type="spellEnd"/>
             <w:r>
@@ -1923,19 +1879,11 @@
               <w:br/>
             </w:r>
             <w:proofErr w:type="spellStart"/>
-            <w:proofErr w:type="gramStart"/>
-            <w:r>
-              <w:rPr>
-                <w:lang w:val="es-CL"/>
-              </w:rPr>
-              <w:t>salidas.service</w:t>
-            </w:r>
-            <w:proofErr w:type="gramEnd"/>
-            <w:r>
-              <w:rPr>
-                <w:lang w:val="es-CL"/>
-              </w:rPr>
-              <w:t>.ts</w:t>
+            <w:r>
+              <w:rPr>
+                <w:lang w:val="es-CL"/>
+              </w:rPr>
+              <w:t>salidas.service.ts</w:t>
             </w:r>
             <w:proofErr w:type="spellEnd"/>
             <w:r>
@@ -2883,21 +2831,7 @@
           <w:lang w:val="es-CL"/>
         </w:rPr>
         <w:lastRenderedPageBreak/>
-        <w:t xml:space="preserve">5 </w:t>
-      </w:r>
-      <w:proofErr w:type="gramStart"/>
-      <w:r>
-        <w:rPr>
-          <w:lang w:val="es-CL"/>
-        </w:rPr>
-        <w:t>Diagrama</w:t>
-      </w:r>
-      <w:proofErr w:type="gramEnd"/>
-      <w:r>
-        <w:rPr>
-          <w:lang w:val="es-CL"/>
-        </w:rPr>
-        <w:t xml:space="preserve"> de actividades actualizado</w:t>
+        <w:t>5 Diagrama de actividades actualizado</w:t>
       </w:r>
     </w:p>
     <w:p>
@@ -3706,7 +3640,13 @@
         <w:rPr>
           <w:lang w:val="es-CL"/>
         </w:rPr>
-        <w:t>Ruta en GitHub y versión: _________________________________________________________</w:t>
+        <w:t xml:space="preserve">Ruta en GitHub y versión: </w:t>
+      </w:r>
+      <w:r>
+        <w:rPr>
+          <w:lang w:val="es-CL"/>
+        </w:rPr>
+        <w:t>https://github.com/Jalvarezza/Gestion_Bodega/tree/main/Fase%202/Evidencia%20Proyecto</w:t>
       </w:r>
     </w:p>
     <w:p>
@@ -3954,14 +3894,7 @@
                 <w:szCs w:val="20"/>
                 <w:lang w:val="es-CL"/>
               </w:rPr>
-              <w:t xml:space="preserve">, </w:t>
-            </w:r>
-            <w:r>
-              <w:rPr>
-                <w:szCs w:val="20"/>
-                <w:lang w:val="es-CL"/>
-              </w:rPr>
-              <w:t>la base de datos asegura que una NV la tome un solo operador. Si otro lo intenta, se le avisa quién la tiene y su lista se actualiza al instante.</w:t>
+              <w:t>, la base de datos asegura que una NV la tome un solo operador. Si otro lo intenta, se le avisa quién la tiene y su lista se actualiza al instante.</w:t>
             </w:r>
             <w:r>
               <w:rPr>
@@ -3970,7 +3903,30 @@
                 <w:szCs w:val="20"/>
                 <w:lang w:val="es-CL"/>
               </w:rPr>
-              <w:t xml:space="preserve"> </w:t>
+              <w:t xml:space="preserve"> Ubicación y producto:</w:t>
+            </w:r>
+            <w:r>
+              <w:rPr>
+                <w:szCs w:val="20"/>
+                <w:lang w:val="es-CL"/>
+              </w:rPr>
+              <w:t xml:space="preserve"> la </w:t>
+            </w:r>
+            <w:proofErr w:type="spellStart"/>
+            <w:r>
+              <w:rPr>
+                <w:szCs w:val="20"/>
+                <w:lang w:val="es-CL"/>
+              </w:rPr>
+              <w:t>tablet</w:t>
+            </w:r>
+            <w:proofErr w:type="spellEnd"/>
+            <w:r>
+              <w:rPr>
+                <w:szCs w:val="20"/>
+                <w:lang w:val="es-CL"/>
+              </w:rPr>
+              <w:t xml:space="preserve"> y la API comprueban que el rack escaneado sea el asignado según FIFO y que el código de barras corresponda al producto. Si algo no coincide, se bloquea el paso y no se descuenta stock.</w:t>
             </w:r>
             <w:r>
               <w:rPr>
@@ -3979,48 +3935,7 @@
                 <w:szCs w:val="20"/>
                 <w:lang w:val="es-CL"/>
               </w:rPr>
-              <w:t>Ubicación y producto:</w:t>
-            </w:r>
-            <w:r>
-              <w:rPr>
-                <w:szCs w:val="20"/>
-                <w:lang w:val="es-CL"/>
-              </w:rPr>
-              <w:t xml:space="preserve"> la </w:t>
-            </w:r>
-            <w:proofErr w:type="spellStart"/>
-            <w:r>
-              <w:rPr>
-                <w:szCs w:val="20"/>
-                <w:lang w:val="es-CL"/>
-              </w:rPr>
-              <w:t>tablet</w:t>
-            </w:r>
-            <w:proofErr w:type="spellEnd"/>
-            <w:r>
-              <w:rPr>
-                <w:szCs w:val="20"/>
-                <w:lang w:val="es-CL"/>
-              </w:rPr>
-              <w:t xml:space="preserve"> y la API comprueban que el rack escaneado sea el asignado según FIFO y que el código de barras corresponda al producto. Si algo no coincide, se bloquea el paso y no se descuenta stock.</w:t>
-            </w:r>
-            <w:r>
-              <w:rPr>
-                <w:b/>
-                <w:bCs/>
-                <w:szCs w:val="20"/>
-                <w:lang w:val="es-CL"/>
-              </w:rPr>
-              <w:t xml:space="preserve"> </w:t>
-            </w:r>
-            <w:r>
-              <w:rPr>
-                <w:b/>
-                <w:bCs/>
-                <w:szCs w:val="20"/>
-                <w:lang w:val="es-CL"/>
-              </w:rPr>
-              <w:t>Cantidades y stock:</w:t>
+              <w:t xml:space="preserve"> Cantidades y stock:</w:t>
             </w:r>
             <w:r>
               <w:rPr>
@@ -4186,21 +4101,7 @@
           <w:lang w:val="es-CL"/>
         </w:rPr>
         <w:lastRenderedPageBreak/>
-        <w:t xml:space="preserve">6 </w:t>
-      </w:r>
-      <w:proofErr w:type="gramStart"/>
-      <w:r>
-        <w:rPr>
-          <w:lang w:val="es-CL"/>
-        </w:rPr>
-        <w:t>Comprobación</w:t>
-      </w:r>
-      <w:proofErr w:type="gramEnd"/>
-      <w:r>
-        <w:rPr>
-          <w:lang w:val="es-CL"/>
-        </w:rPr>
-        <w:t xml:space="preserve"> de un caso de uso</w:t>
+        <w:t>6 Comprobación de un caso de uso</w:t>
       </w:r>
     </w:p>
     <w:tbl>
@@ -4439,19 +4340,11 @@
                 <w:lang w:val="es-CL"/>
               </w:rPr>
             </w:pPr>
-            <w:proofErr w:type="gramStart"/>
-            <w:r>
-              <w:rPr>
-                <w:lang w:val="es-CL"/>
-              </w:rPr>
-              <w:t>Pre condición</w:t>
-            </w:r>
-            <w:proofErr w:type="gramEnd"/>
-            <w:r>
-              <w:rPr>
-                <w:lang w:val="es-CL"/>
-              </w:rPr>
-              <w:t xml:space="preserve">: </w:t>
+            <w:r>
+              <w:rPr>
+                <w:lang w:val="es-CL"/>
+              </w:rPr>
+              <w:t xml:space="preserve">Pre condición: </w:t>
             </w:r>
             <w:r>
               <w:rPr>
@@ -5139,21 +5032,7 @@
               <w:rPr>
                 <w:lang w:val="es-CL"/>
               </w:rPr>
-              <w:t xml:space="preserve">Se escanea una ubicación errónea: la </w:t>
-            </w:r>
-            <w:proofErr w:type="gramStart"/>
-            <w:r>
-              <w:rPr>
-                <w:lang w:val="es-CL"/>
-              </w:rPr>
-              <w:t>app</w:t>
-            </w:r>
-            <w:proofErr w:type="gramEnd"/>
-            <w:r>
-              <w:rPr>
-                <w:lang w:val="es-CL"/>
-              </w:rPr>
-              <w:t xml:space="preserve"> muestra alerta "Rack incorrecto" y bloquea el avance hasta escanear el rack correcto</w:t>
+              <w:t>Se escanea una ubicación errónea: la app muestra alerta "Rack incorrecto" y bloquea el avance hasta escanear el rack correcto</w:t>
             </w:r>
           </w:p>
         </w:tc>
@@ -5221,21 +5100,7 @@
         <w:rPr>
           <w:lang w:val="es-CL"/>
         </w:rPr>
-        <w:t xml:space="preserve">7 </w:t>
-      </w:r>
-      <w:proofErr w:type="gramStart"/>
-      <w:r>
-        <w:rPr>
-          <w:lang w:val="es-CL"/>
-        </w:rPr>
-        <w:t>Compromiso</w:t>
-      </w:r>
-      <w:proofErr w:type="gramEnd"/>
-      <w:r>
-        <w:rPr>
-          <w:lang w:val="es-CL"/>
-        </w:rPr>
-        <w:t xml:space="preserve"> para la siguiente iteración</w:t>
+        <w:t>7 Compromiso para la siguiente iteración</w:t>
       </w:r>
     </w:p>
     <w:tbl>
@@ -5350,15 +5215,14 @@
                 <w:sz w:val="18"/>
                 <w:lang w:val="es-CL"/>
               </w:rPr>
-              <w:t>Picking FIFO no valida de punta a punta el descuento de stock ni el cambio automático a estado</w:t>
-            </w:r>
-            <w:r>
-              <w:rPr>
-                <w:sz w:val="18"/>
-                <w:lang w:val="es-CL"/>
-              </w:rPr>
               <w:br/>
             </w:r>
+            <w:r>
+              <w:rPr>
+                <w:lang w:val="es-CL"/>
+              </w:rPr>
+              <w:t>Flujo de NV Despacho no se ha recorrido por falta de NV en estado completa.</w:t>
+            </w:r>
           </w:p>
         </w:tc>
         <w:tc>
@@ -5377,23 +5241,13 @@
                 <w:sz w:val="18"/>
                 <w:lang w:val="es-CL"/>
               </w:rPr>
-              <w:t xml:space="preserve">Módulo NV Preparación funcional de punta a punta con </w:t>
-            </w:r>
-            <w:proofErr w:type="spellStart"/>
-            <w:r>
-              <w:rPr>
-                <w:sz w:val="18"/>
-                <w:lang w:val="es-CL"/>
-              </w:rPr>
-              <w:t>picking</w:t>
-            </w:r>
-            <w:proofErr w:type="spellEnd"/>
-            <w:r>
-              <w:rPr>
-                <w:sz w:val="18"/>
-                <w:lang w:val="es-CL"/>
-              </w:rPr>
-              <w:t xml:space="preserve"> FIFO, descuento de lotes y paso automático de NV a completa.</w:t>
+              <w:br/>
+            </w:r>
+            <w:r>
+              <w:rPr>
+                <w:lang w:val="es-CL"/>
+              </w:rPr>
+              <w:t>Probar flujo de revisión con escaneo y despacho asignando chofer</w:t>
             </w:r>
           </w:p>
         </w:tc>
@@ -5411,13 +5265,28 @@
             <w:r>
               <w:rPr>
                 <w:sz w:val="18"/>
+              </w:rPr>
+              <w:t>Jorge Alvarez 2</w:t>
+            </w:r>
+            <w:r>
+              <w:rPr>
+                <w:sz w:val="18"/>
+              </w:rPr>
+              <w:t>8</w:t>
+            </w:r>
+            <w:r>
+              <w:rPr>
+                <w:sz w:val="18"/>
+              </w:rPr>
+              <w:t>-10-2026</w:t>
+            </w:r>
+            <w:r>
+              <w:rPr>
+                <w:sz w:val="18"/>
                 <w:lang w:val="es-CL"/>
               </w:rPr>
               <w:br/>
             </w:r>
-            <w:r>
-              <w:t>Jorge Alvarez (21-10-2026</w:t>
-            </w:r>
           </w:p>
         </w:tc>
         <w:tc>
@@ -5436,7 +5305,7 @@
                 <w:sz w:val="18"/>
                 <w:lang w:val="es-CL"/>
               </w:rPr>
-              <w:t>Un operador toma la NV, escanea rack/producto en orden FIFO, el stock se descuenta del lote en BBDD y la NV pasa automáticamente a completa.</w:t>
+              <w:t>El validador escanea cada producto de una NV en completa, asigna chofer y la NV pasa a despachada guardando su registro</w:t>
             </w:r>
             <w:r>
               <w:rPr>
@@ -5457,21 +5326,32 @@
             <w:pPr>
               <w:spacing w:after="100"/>
               <w:rPr>
-                <w:lang w:val="es-CL"/>
-              </w:rPr>
-            </w:pPr>
-            <w:r>
-              <w:rPr>
-                <w:sz w:val="18"/>
-                <w:lang w:val="es-CL"/>
-              </w:rPr>
-              <w:br/>
-            </w:r>
-            <w:r>
-              <w:rPr>
-                <w:lang w:val="es-CL"/>
-              </w:rPr>
-              <w:t>Flujo de NV Despacho no se ha recorrido por falta de NV en estado completa.</w:t>
+                <w:sz w:val="18"/>
+                <w:lang w:val="es-CL"/>
+              </w:rPr>
+            </w:pPr>
+            <w:r>
+              <w:rPr>
+                <w:sz w:val="18"/>
+                <w:lang w:val="es-CL"/>
+              </w:rPr>
+              <w:t xml:space="preserve">Los pedidos de gran volumen llegan solo como orden de compra en Excel, sin nota de venta, por lo que no pueden prepararse con el flujo actual. Se requiere un módulo independiente de </w:t>
+            </w:r>
+            <w:proofErr w:type="spellStart"/>
+            <w:r>
+              <w:rPr>
+                <w:sz w:val="18"/>
+                <w:lang w:val="es-CL"/>
+              </w:rPr>
+              <w:t>picking</w:t>
+            </w:r>
+            <w:proofErr w:type="spellEnd"/>
+            <w:r>
+              <w:rPr>
+                <w:sz w:val="18"/>
+                <w:lang w:val="es-CL"/>
+              </w:rPr>
+              <w:t xml:space="preserve"> masivo por orden de compra.</w:t>
             </w:r>
           </w:p>
         </w:tc>
@@ -5483,21 +5363,48 @@
             <w:pPr>
               <w:spacing w:after="100"/>
               <w:rPr>
-                <w:lang w:val="es-CL"/>
-              </w:rPr>
-            </w:pPr>
-            <w:r>
-              <w:rPr>
-                <w:sz w:val="18"/>
-                <w:lang w:val="es-CL"/>
-              </w:rPr>
-              <w:br/>
-            </w:r>
-            <w:r>
-              <w:rPr>
-                <w:lang w:val="es-CL"/>
-              </w:rPr>
-              <w:t>Probar flujo de revisión con escaneo y despacho asignando chofer</w:t>
+                <w:sz w:val="18"/>
+                <w:lang w:val="es-CL"/>
+              </w:rPr>
+            </w:pPr>
+            <w:r>
+              <w:rPr>
+                <w:sz w:val="18"/>
+                <w:lang w:val="es-CL"/>
+              </w:rPr>
+              <w:t xml:space="preserve">Diseñar e implementar el módulo de </w:t>
+            </w:r>
+            <w:proofErr w:type="spellStart"/>
+            <w:r>
+              <w:rPr>
+                <w:sz w:val="18"/>
+                <w:lang w:val="es-CL"/>
+              </w:rPr>
+              <w:t>picking</w:t>
+            </w:r>
+            <w:proofErr w:type="spellEnd"/>
+            <w:r>
+              <w:rPr>
+                <w:sz w:val="18"/>
+                <w:lang w:val="es-CL"/>
+              </w:rPr>
+              <w:t xml:space="preserve"> masivo: carga del Excel de la orden de compra, generación de las tareas de </w:t>
+            </w:r>
+            <w:proofErr w:type="spellStart"/>
+            <w:r>
+              <w:rPr>
+                <w:sz w:val="18"/>
+                <w:lang w:val="es-CL"/>
+              </w:rPr>
+              <w:t>picking</w:t>
+            </w:r>
+            <w:proofErr w:type="spellEnd"/>
+            <w:r>
+              <w:rPr>
+                <w:sz w:val="18"/>
+                <w:lang w:val="es-CL"/>
+              </w:rPr>
+              <w:t xml:space="preserve"> por producto y ubicación, y seguimiento del avance de la orden.</w:t>
             </w:r>
           </w:p>
         </w:tc>
@@ -5509,21 +5416,16 @@
             <w:pPr>
               <w:spacing w:after="100"/>
               <w:rPr>
-                <w:lang w:val="es-CL"/>
-              </w:rPr>
-            </w:pPr>
-            <w:r>
-              <w:rPr>
-                <w:sz w:val="18"/>
-              </w:rPr>
-              <w:t>Jorge Alvarez (21-10-2026</w:t>
-            </w:r>
-            <w:r>
-              <w:rPr>
-                <w:sz w:val="18"/>
-                <w:lang w:val="es-CL"/>
-              </w:rPr>
-              <w:br/>
+                <w:sz w:val="18"/>
+                <w:lang w:val="es-CL"/>
+              </w:rPr>
+            </w:pPr>
+            <w:r>
+              <w:rPr>
+                <w:sz w:val="18"/>
+                <w:lang w:val="es-CL"/>
+              </w:rPr>
+              <w:t>Jorge Alvarez 28-10-2026</w:t>
             </w:r>
           </w:p>
         </w:tc>
@@ -5535,22 +5437,32 @@
             <w:pPr>
               <w:spacing w:after="100"/>
               <w:rPr>
-                <w:lang w:val="es-CL"/>
-              </w:rPr>
-            </w:pPr>
-            <w:r>
-              <w:rPr>
-                <w:sz w:val="18"/>
-                <w:lang w:val="es-CL"/>
-              </w:rPr>
-              <w:t>El validador escanea cada producto de una NV en completa, asigna chofer y la NV pasa a despachada guardando su registro</w:t>
-            </w:r>
-            <w:r>
-              <w:rPr>
-                <w:sz w:val="18"/>
-                <w:lang w:val="es-CL"/>
-              </w:rPr>
-              <w:br/>
+                <w:sz w:val="18"/>
+                <w:lang w:val="es-CL"/>
+              </w:rPr>
+            </w:pPr>
+            <w:r>
+              <w:rPr>
+                <w:sz w:val="18"/>
+                <w:lang w:val="es-CL"/>
+              </w:rPr>
+              <w:t xml:space="preserve">Al cargar el Excel de una orden de compra, el sistema crea la orden con todas sus líneas. El operador realiza el </w:t>
+            </w:r>
+            <w:proofErr w:type="spellStart"/>
+            <w:r>
+              <w:rPr>
+                <w:sz w:val="18"/>
+                <w:lang w:val="es-CL"/>
+              </w:rPr>
+              <w:t>picking</w:t>
+            </w:r>
+            <w:proofErr w:type="spellEnd"/>
+            <w:r>
+              <w:rPr>
+                <w:sz w:val="18"/>
+                <w:lang w:val="es-CL"/>
+              </w:rPr>
+              <w:t xml:space="preserve"> con validación de rack y producto, el stock se descuenta en orden FIFO y la orden pasa a “completada” al terminar todas sus líneas.</w:t>
             </w:r>
           </w:p>
         </w:tc>
@@ -5579,49 +5491,7 @@
         <w:rPr>
           <w:lang w:val="es-CL"/>
         </w:rPr>
-        <w:t xml:space="preserve">Resultado de la revisión: </w:t>
-      </w:r>
-      <w:proofErr w:type="gramStart"/>
-      <w:r>
-        <w:rPr>
-          <w:lang w:val="es-CL"/>
-        </w:rPr>
-        <w:t>[ ]</w:t>
-      </w:r>
-      <w:proofErr w:type="gramEnd"/>
-      <w:r>
-        <w:rPr>
-          <w:lang w:val="es-CL"/>
-        </w:rPr>
-        <w:t xml:space="preserve"> </w:t>
-      </w:r>
-      <w:proofErr w:type="gramStart"/>
-      <w:r>
-        <w:rPr>
-          <w:lang w:val="es-CL"/>
-        </w:rPr>
-        <w:t>Coherente  [</w:t>
-      </w:r>
-      <w:proofErr w:type="gramEnd"/>
-      <w:r>
-        <w:rPr>
-          <w:lang w:val="es-CL"/>
-        </w:rPr>
-        <w:t xml:space="preserve"> ] Coherente con </w:t>
-      </w:r>
-      <w:proofErr w:type="gramStart"/>
-      <w:r>
-        <w:rPr>
-          <w:lang w:val="es-CL"/>
-        </w:rPr>
-        <w:t>ajustes  [</w:t>
-      </w:r>
-      <w:proofErr w:type="gramEnd"/>
-      <w:r>
-        <w:rPr>
-          <w:lang w:val="es-CL"/>
-        </w:rPr>
-        <w:t xml:space="preserve"> ] Requiere corrección</w:t>
+        <w:t>Resultado de la revisión: [ ] Coherente  [ ] Coherente con ajustes  [ ] Requiere corrección</w:t>
       </w:r>
       <w:r>
         <w:rPr>
@@ -5635,21 +5505,7 @@
           <w:lang w:val="es-CL"/>
         </w:rPr>
         <w:br/>
-        <w:t>Representante: _______________________</w:t>
-      </w:r>
-      <w:proofErr w:type="gramStart"/>
-      <w:r>
-        <w:rPr>
-          <w:lang w:val="es-CL"/>
-        </w:rPr>
-        <w:t>_  Docente</w:t>
-      </w:r>
-      <w:proofErr w:type="gramEnd"/>
-      <w:r>
-        <w:rPr>
-          <w:lang w:val="es-CL"/>
-        </w:rPr>
-        <w:t xml:space="preserve"> guía: ________________________</w:t>
+        <w:t>Representante: ________________________  Docente guía: ________________________</w:t>
       </w:r>
     </w:p>
     <w:p>
@@ -5677,21 +5533,7 @@
           <w:lang w:val="es-CL"/>
         </w:rPr>
         <w:lastRenderedPageBreak/>
-        <w:t xml:space="preserve">8 </w:t>
-      </w:r>
-      <w:proofErr w:type="gramStart"/>
-      <w:r>
-        <w:rPr>
-          <w:lang w:val="es-CL"/>
-        </w:rPr>
-        <w:t>Mejoras</w:t>
-      </w:r>
-      <w:proofErr w:type="gramEnd"/>
-      <w:r>
-        <w:rPr>
-          <w:lang w:val="es-CL"/>
-        </w:rPr>
-        <w:t xml:space="preserve"> reflexión y avance del informe</w:t>
+        <w:t>8 Mejoras reflexión y avance del informe</w:t>
       </w:r>
     </w:p>
     <w:p>
@@ -5846,21 +5688,7 @@
               <w:rPr>
                 <w:lang w:val="es-CL"/>
               </w:rPr>
-              <w:t xml:space="preserve">La cámara de la </w:t>
-            </w:r>
-            <w:proofErr w:type="gramStart"/>
-            <w:r>
-              <w:rPr>
-                <w:lang w:val="es-CL"/>
-              </w:rPr>
-              <w:t>app</w:t>
-            </w:r>
-            <w:proofErr w:type="gramEnd"/>
-            <w:r>
-              <w:rPr>
-                <w:lang w:val="es-CL"/>
-              </w:rPr>
-              <w:t xml:space="preserve"> no </w:t>
+              <w:t xml:space="preserve">La cámara de la app no </w:t>
             </w:r>
             <w:proofErr w:type="spellStart"/>
             <w:r>
@@ -6259,21 +6087,19 @@
           <w:lang w:val="es-CL"/>
         </w:rPr>
         <w:br/>
-        <w:t>____________________________________________________________________________</w:t>
+      </w:r>
+      <w:r>
+        <w:rPr>
+          <w:lang w:val="es-CL"/>
+        </w:rPr>
+        <w:t>Si bien el diagrama me hizo entender el flujo completo y correcto de una NV también me demostró que existe una brecha de la cual no esta cubierta del todo como la mencionada como compromiso para la próxima iteración ya que se implementara otro modulo que permite gestionar de manera correcta la salida de productos en mayor cantidad asociadas a una sola orden de compra.</w:t>
       </w:r>
       <w:r>
         <w:rPr>
           <w:lang w:val="es-CL"/>
         </w:rPr>
         <w:br/>
-        <w:t>____________________________________________________________________________</w:t>
-      </w:r>
-      <w:r>
-        <w:rPr>
-          <w:lang w:val="es-CL"/>
-        </w:rPr>
-        <w:br/>
-        <w:t>Ubicación de la reflexión en el diario: ______________________________________________</w:t>
+        <w:t xml:space="preserve">Ubicación de la reflexión en el diario: </w:t>
       </w:r>
     </w:p>
     <w:p>
@@ -6514,7 +6340,14 @@
         <w:rPr>
           <w:lang w:val="es-CL"/>
         </w:rPr>
-        <w:t>La versión 1.0 sigue siendo plenamente viable. Al resolver las dependencias técnicas de HTTPS y la carga inicial de lotes de inventario, el desarrollo pendiente consiste fundamentalmente en la integración y validación de flujos que ya están construidos en código</w:t>
+        <w:t xml:space="preserve">La versión 1.0 sigue siendo plenamente viable. Al resolver las dependencias técnicas de HTTPS y la carga inicial de lotes de </w:t>
+      </w:r>
+      <w:r>
+        <w:rPr>
+          <w:lang w:val="es-CL"/>
+        </w:rPr>
+        <w:lastRenderedPageBreak/>
+        <w:t>inventario, el desarrollo pendiente consiste fundamentalmente en la integración y validación de flujos que ya están construidos en código</w:t>
       </w:r>
     </w:p>
     <w:sectPr>

</xml_diff>